<commit_message>
add warm_profile_2_crisp route and related updates
Co-Authored-By: Claude <noreply@anthropic.com>
</commit_message>
<xml_diff>
--- a/Cold Start Content/Glance_TV_Warm_Start_Ananya.docx
+++ b/Cold Start Content/Glance_TV_Warm_Start_Ananya.docx
@@ -57,59 +57,7 @@
           <w:szCs w:val="20"/>
           <w:lang w:eastAsia="en-GB"/>
         </w:rPr>
-        <w:t>Same 11 images as the </w:t>
-      </w:r>
-      <w:proofErr w:type="gramStart"/>
-      <w:r>
-        <w:rPr>
-          <w:rFonts w:eastAsia="Times New Roman" w:cs="Segoe UI"/>
-          <w:i/>
-          <w:iCs/>
-          <w:color w:val="555555"/>
-          <w:sz w:val="20"/>
-          <w:szCs w:val="20"/>
-          <w:lang w:eastAsia="en-GB"/>
-        </w:rPr>
-        <w:t>cold-start</w:t>
-      </w:r>
-      <w:proofErr w:type="gramEnd"/>
-      <w:r>
-        <w:rPr>
-          <w:rFonts w:eastAsia="Times New Roman" w:cs="Segoe UI"/>
-          <w:i/>
-          <w:iCs/>
-          <w:color w:val="555555"/>
-          <w:sz w:val="20"/>
-          <w:szCs w:val="20"/>
-          <w:lang w:eastAsia="en-GB"/>
-        </w:rPr>
-        <w:t> </w:t>
-      </w:r>
-      <w:proofErr w:type="gramStart"/>
-      <w:r>
-        <w:rPr>
-          <w:rFonts w:eastAsia="Times New Roman" w:cs="Segoe UI"/>
-          <w:i/>
-          <w:iCs/>
-          <w:color w:val="555555"/>
-          <w:sz w:val="20"/>
-          <w:szCs w:val="20"/>
-          <w:lang w:eastAsia="en-GB"/>
-        </w:rPr>
-        <w:t>deck, but</w:t>
-      </w:r>
-      <w:proofErr w:type="gramEnd"/>
-      <w:r>
-        <w:rPr>
-          <w:rFonts w:eastAsia="Times New Roman" w:cs="Segoe UI"/>
-          <w:i/>
-          <w:iCs/>
-          <w:color w:val="555555"/>
-          <w:sz w:val="20"/>
-          <w:szCs w:val="20"/>
-          <w:lang w:eastAsia="en-GB"/>
-        </w:rPr>
-        <w:t> written for Ananya. Each card pairs the agent's first line (her captured signals) with the recommendation (the world fact + her move).</w:t>
+        <w:t>Same 11 images as the cold-start deck, but written for Ananya. Each card pairs the agent's first line (her captured signals) with the recommendation (the world fact + her move).</w:t>
       </w:r>
       <w:r>
         <w:rPr>
@@ -603,33 +551,7 @@
                 <w:szCs w:val="18"/>
                 <w:lang w:eastAsia="en-GB"/>
               </w:rPr>
-              <w:t>Balcony </w:t>
-            </w:r>
-            <w:proofErr w:type="spellStart"/>
-            <w:r>
-              <w:rPr>
-                <w:rFonts w:eastAsia="Times New Roman" w:cs="Times New Roman"/>
-                <w:i/>
-                <w:iCs/>
-                <w:color w:val="555555"/>
-                <w:sz w:val="18"/>
-                <w:szCs w:val="18"/>
-                <w:lang w:eastAsia="en-GB"/>
-              </w:rPr>
-              <w:t>Escape.webp</w:t>
-            </w:r>
-            <w:proofErr w:type="spellEnd"/>
-            <w:r>
-              <w:rPr>
-                <w:rFonts w:eastAsia="Times New Roman" w:cs="Times New Roman"/>
-                <w:i/>
-                <w:iCs/>
-                <w:color w:val="555555"/>
-                <w:sz w:val="18"/>
-                <w:szCs w:val="18"/>
-                <w:lang w:eastAsia="en-GB"/>
-              </w:rPr>
-              <w:t> — hanging plants, soft fairy lights, the city blurred behind the rain.</w:t>
+              <w:t>Balcony Escape.webp — hanging plants, soft fairy lights, the city blurred behind the rain.</w:t>
             </w:r>
             <w:r>
               <w:rPr>
@@ -673,27 +595,7 @@
                 <w:szCs w:val="18"/>
                 <w:lang w:eastAsia="en-GB"/>
               </w:rPr>
-              <w:t>You asked me about monsoon-friendly plants in April. The Sunlite planter set is on your </w:t>
-            </w:r>
-            <w:proofErr w:type="spellStart"/>
-            <w:r>
-              <w:rPr>
-                <w:rFonts w:eastAsia="Times New Roman" w:cs="Times New Roman"/>
-                <w:sz w:val="18"/>
-                <w:szCs w:val="18"/>
-                <w:lang w:eastAsia="en-GB"/>
-              </w:rPr>
-              <w:t>wishlist</w:t>
-            </w:r>
-            <w:proofErr w:type="spellEnd"/>
-            <w:r>
-              <w:rPr>
-                <w:rFonts w:eastAsia="Times New Roman" w:cs="Times New Roman"/>
-                <w:sz w:val="18"/>
-                <w:szCs w:val="18"/>
-                <w:lang w:eastAsia="en-GB"/>
-              </w:rPr>
-              <w:t>.</w:t>
+              <w:t>You asked me about monsoon-friendly plants in April. The Sunlite planter set is on your wishlist.</w:t>
             </w:r>
             <w:r>
               <w:rPr>
@@ -736,27 +638,7 @@
                 <w:szCs w:val="20"/>
                 <w:lang w:eastAsia="en-GB"/>
               </w:rPr>
-              <w:t>Lalbagh's Independence Day show is eight weeks out — that's when nursery prices climb. I'll pull together a starter set that matches the planters you saved: five monsoon-friendly plants plus warm fairy lights, under ₹3,500 across Cubbon Nursery, </w:t>
-            </w:r>
-            <w:proofErr w:type="spellStart"/>
-            <w:r>
-              <w:rPr>
-                <w:rFonts w:eastAsia="Times New Roman" w:cs="Times New Roman"/>
-                <w:sz w:val="20"/>
-                <w:szCs w:val="20"/>
-                <w:lang w:eastAsia="en-GB"/>
-              </w:rPr>
-              <w:t>Hosa</w:t>
-            </w:r>
-            <w:proofErr w:type="spellEnd"/>
-            <w:r>
-              <w:rPr>
-                <w:rFonts w:eastAsia="Times New Roman" w:cs="Times New Roman"/>
-                <w:sz w:val="20"/>
-                <w:szCs w:val="20"/>
-                <w:lang w:eastAsia="en-GB"/>
-              </w:rPr>
-              <w:t>, and Gandhi Bazaar. Get there before 10.</w:t>
+              <w:t>Lalbagh's Independence Day show is eight weeks out — that's when nursery prices climb. I'll pull together a starter set that matches the planters you saved: five monsoon-friendly plants plus warm fairy lights, under ₹3,500 across Cubbon Nursery, Hosa, and Gandhi Bazaar. Get there before 10.</w:t>
             </w:r>
             <w:r>
               <w:rPr>
@@ -974,33 +856,7 @@
                 <w:szCs w:val="18"/>
                 <w:lang w:eastAsia="en-GB"/>
               </w:rPr>
-              <w:t>Gond </w:t>
-            </w:r>
-            <w:proofErr w:type="spellStart"/>
-            <w:r>
-              <w:rPr>
-                <w:rFonts w:eastAsia="Times New Roman" w:cs="Times New Roman"/>
-                <w:i/>
-                <w:iCs/>
-                <w:color w:val="555555"/>
-                <w:sz w:val="18"/>
-                <w:szCs w:val="18"/>
-                <w:lang w:eastAsia="en-GB"/>
-              </w:rPr>
-              <w:t>Art.webp</w:t>
-            </w:r>
-            <w:proofErr w:type="spellEnd"/>
-            <w:r>
-              <w:rPr>
-                <w:rFonts w:eastAsia="Times New Roman" w:cs="Times New Roman"/>
-                <w:i/>
-                <w:iCs/>
-                <w:color w:val="555555"/>
-                <w:sz w:val="18"/>
-                <w:szCs w:val="18"/>
-                <w:lang w:eastAsia="en-GB"/>
-              </w:rPr>
-              <w:t> — a peacock takes shape, dot by dot, in the studio's morning light.</w:t>
+              <w:t>Gond Art.webp — a peacock takes shape, dot by dot, in the studio's morning light.</w:t>
             </w:r>
             <w:r>
               <w:rPr>
@@ -1043,27 +899,7 @@
                 <w:szCs w:val="18"/>
                 <w:lang w:eastAsia="en-GB"/>
               </w:rPr>
-              <w:t>You bookmarked the </w:t>
-            </w:r>
-            <w:proofErr w:type="spellStart"/>
-            <w:r>
-              <w:rPr>
-                <w:rFonts w:eastAsia="Times New Roman" w:cs="Times New Roman"/>
-                <w:sz w:val="18"/>
-                <w:szCs w:val="18"/>
-                <w:lang w:eastAsia="en-GB"/>
-              </w:rPr>
-              <w:t>Bhajju</w:t>
-            </w:r>
-            <w:proofErr w:type="spellEnd"/>
-            <w:r>
-              <w:rPr>
-                <w:rFonts w:eastAsia="Times New Roman" w:cs="Times New Roman"/>
-                <w:sz w:val="18"/>
-                <w:szCs w:val="18"/>
-                <w:lang w:eastAsia="en-GB"/>
-              </w:rPr>
-              <w:t> Shyam show. In May, you asked me about beginner art workshops.</w:t>
+              <w:t>You bookmarked the Bhajju Shyam show. In May, you asked me about beginner art workshops.</w:t>
             </w:r>
             <w:r>
               <w:rPr>
@@ -1098,7 +934,6 @@
                 <w:lang w:val="en-IN" w:eastAsia="en-GB"/>
               </w:rPr>
             </w:pPr>
-            <w:proofErr w:type="spellStart"/>
             <w:r>
               <w:rPr>
                 <w:rFonts w:eastAsia="Times New Roman" w:cs="Times New Roman"/>
@@ -1106,37 +941,7 @@
                 <w:szCs w:val="20"/>
                 <w:lang w:eastAsia="en-GB"/>
               </w:rPr>
-              <w:t>Bhajju</w:t>
-            </w:r>
-            <w:proofErr w:type="spellEnd"/>
-            <w:r>
-              <w:rPr>
-                <w:rFonts w:eastAsia="Times New Roman" w:cs="Times New Roman"/>
-                <w:sz w:val="20"/>
-                <w:szCs w:val="20"/>
-                <w:lang w:eastAsia="en-GB"/>
-              </w:rPr>
-              <w:t xml:space="preserve"> Shyam's retrospective at Bangalore International Centre is the largest Gond show the city has ever hosted. Three studios near you — Kalakshetra, Studio </w:t>
-            </w:r>
-            <w:proofErr w:type="spellStart"/>
-            <w:r>
-              <w:rPr>
-                <w:rFonts w:eastAsia="Times New Roman" w:cs="Times New Roman"/>
-                <w:sz w:val="20"/>
-                <w:szCs w:val="20"/>
-                <w:lang w:eastAsia="en-GB"/>
-              </w:rPr>
-              <w:t>Eksaat</w:t>
-            </w:r>
-            <w:proofErr w:type="spellEnd"/>
-            <w:r>
-              <w:rPr>
-                <w:rFonts w:eastAsia="Times New Roman" w:cs="Times New Roman"/>
-                <w:sz w:val="20"/>
-                <w:szCs w:val="20"/>
-                <w:lang w:eastAsia="en-GB"/>
-              </w:rPr>
-              <w:t>, Rangoli Metro Art Centre — have added Saturday Gond drop-ins for beginners, ₹1,800 a session, materials included. I'd book you the 10am slot — the dot-work needs that light.</w:t>
+              <w:t>Bhajju Shyam's retrospective at Bangalore International Centre is the largest Gond show the city has ever hosted. Three studios near you — Kalakshetra, Studio Eksaat, Rangoli Metro Art Centre — have added Saturday Gond drop-ins for beginners, ₹1,800 a session, materials included. I'd book you the 10am slot — the dot-work needs that light.</w:t>
             </w:r>
             <w:r>
               <w:rPr>
@@ -1400,27 +1205,7 @@
                 <w:szCs w:val="18"/>
                 <w:lang w:eastAsia="en-GB"/>
               </w:rPr>
-              <w:t>The Tanishq Mia capsule is on your </w:t>
-            </w:r>
-            <w:proofErr w:type="spellStart"/>
-            <w:r>
-              <w:rPr>
-                <w:rFonts w:eastAsia="Times New Roman" w:cs="Times New Roman"/>
-                <w:sz w:val="18"/>
-                <w:szCs w:val="18"/>
-                <w:lang w:eastAsia="en-GB"/>
-              </w:rPr>
-              <w:t>wishlist</w:t>
-            </w:r>
-            <w:proofErr w:type="spellEnd"/>
-            <w:r>
-              <w:rPr>
-                <w:rFonts w:eastAsia="Times New Roman" w:cs="Times New Roman"/>
-                <w:sz w:val="18"/>
-                <w:szCs w:val="18"/>
-                <w:lang w:eastAsia="en-GB"/>
-              </w:rPr>
-              <w:t>. You asked me to track the gold price in March.</w:t>
+              <w:t>The Tanishq Mia capsule is on your wishlist. You asked me to track the gold price in March.</w:t>
             </w:r>
             <w:r>
               <w:rPr>
@@ -1463,87 +1248,7 @@
                 <w:szCs w:val="20"/>
                 <w:lang w:eastAsia="en-GB"/>
               </w:rPr>
-              <w:t>Gold dipped to ₹71,400 per 10g this week — the softest it's been since March, and </w:t>
-            </w:r>
-            <w:proofErr w:type="spellStart"/>
-            <w:r>
-              <w:rPr>
-                <w:rFonts w:eastAsia="Times New Roman" w:cs="Times New Roman"/>
-                <w:sz w:val="20"/>
-                <w:szCs w:val="20"/>
-                <w:lang w:eastAsia="en-GB"/>
-              </w:rPr>
-              <w:t>jewellers</w:t>
-            </w:r>
-            <w:proofErr w:type="spellEnd"/>
-            <w:r>
-              <w:rPr>
-                <w:rFonts w:eastAsia="Times New Roman" w:cs="Times New Roman"/>
-                <w:sz w:val="20"/>
-                <w:szCs w:val="20"/>
-                <w:lang w:eastAsia="en-GB"/>
-              </w:rPr>
-              <w:t> are calling it before Onam pulls it back up. Tanishq Mia, </w:t>
-            </w:r>
-            <w:proofErr w:type="spellStart"/>
-            <w:r>
-              <w:rPr>
-                <w:rFonts w:eastAsia="Times New Roman" w:cs="Times New Roman"/>
-                <w:sz w:val="20"/>
-                <w:szCs w:val="20"/>
-                <w:lang w:eastAsia="en-GB"/>
-              </w:rPr>
-              <w:t>CaratLane</w:t>
-            </w:r>
-            <w:proofErr w:type="spellEnd"/>
-            <w:r>
-              <w:rPr>
-                <w:rFonts w:eastAsia="Times New Roman" w:cs="Times New Roman"/>
-                <w:sz w:val="20"/>
-                <w:szCs w:val="20"/>
-                <w:lang w:eastAsia="en-GB"/>
-              </w:rPr>
-              <w:t> </w:t>
-            </w:r>
-            <w:proofErr w:type="spellStart"/>
-            <w:r>
-              <w:rPr>
-                <w:rFonts w:eastAsia="Times New Roman" w:cs="Times New Roman"/>
-                <w:sz w:val="20"/>
-                <w:szCs w:val="20"/>
-                <w:lang w:eastAsia="en-GB"/>
-              </w:rPr>
-              <w:t>Everyday</w:t>
-            </w:r>
-            <w:proofErr w:type="spellEnd"/>
-            <w:r>
-              <w:rPr>
-                <w:rFonts w:eastAsia="Times New Roman" w:cs="Times New Roman"/>
-                <w:sz w:val="20"/>
-                <w:szCs w:val="20"/>
-                <w:lang w:eastAsia="en-GB"/>
-              </w:rPr>
-              <w:t xml:space="preserve">, and Kalyan </w:t>
-            </w:r>
-            <w:proofErr w:type="spellStart"/>
-            <w:r>
-              <w:rPr>
-                <w:rFonts w:eastAsia="Times New Roman" w:cs="Times New Roman"/>
-                <w:sz w:val="20"/>
-                <w:szCs w:val="20"/>
-                <w:lang w:eastAsia="en-GB"/>
-              </w:rPr>
-              <w:t>Muhurat</w:t>
-            </w:r>
-            <w:proofErr w:type="spellEnd"/>
-            <w:r>
-              <w:rPr>
-                <w:rFonts w:eastAsia="Times New Roman" w:cs="Times New Roman"/>
-                <w:sz w:val="20"/>
-                <w:szCs w:val="20"/>
-                <w:lang w:eastAsia="en-GB"/>
-              </w:rPr>
-              <w:t xml:space="preserve"> all dropped layered capsules in the last fortnight. I'll shortlist a chain, cuff, and two-ring stack under 8g — sits between ₹40k and ₹80k.</w:t>
+              <w:t>Gold dipped to ₹71,400 per 10g this week — the softest it's been since March, and jewellers are calling it before Onam pulls it back up. Tanishq Mia, CaratLane Everyday, and Kalyan Muhurat all dropped layered capsules in the last fortnight. I'll shortlist a chain, cuff, and two-ring stack under 8g — sits between ₹40k and ₹80k.</w:t>
             </w:r>
             <w:r>
               <w:rPr>
@@ -1761,33 +1466,7 @@
                 <w:szCs w:val="18"/>
                 <w:lang w:eastAsia="en-GB"/>
               </w:rPr>
-              <w:t>Monsoon </w:t>
-            </w:r>
-            <w:proofErr w:type="spellStart"/>
-            <w:r>
-              <w:rPr>
-                <w:rFonts w:eastAsia="Times New Roman" w:cs="Times New Roman"/>
-                <w:i/>
-                <w:iCs/>
-                <w:color w:val="555555"/>
-                <w:sz w:val="18"/>
-                <w:szCs w:val="18"/>
-                <w:lang w:eastAsia="en-GB"/>
-              </w:rPr>
-              <w:t>Football.webp</w:t>
-            </w:r>
-            <w:proofErr w:type="spellEnd"/>
-            <w:r>
-              <w:rPr>
-                <w:rFonts w:eastAsia="Times New Roman" w:cs="Times New Roman"/>
-                <w:i/>
-                <w:iCs/>
-                <w:color w:val="555555"/>
-                <w:sz w:val="18"/>
-                <w:szCs w:val="18"/>
-                <w:lang w:eastAsia="en-GB"/>
-              </w:rPr>
-              <w:t> — a clean strike on wet grass, the city's loudest sport in the rain.</w:t>
+              <w:t>Monsoon Football.webp — a clean strike on wet grass, the city's loudest sport in the rain.</w:t>
             </w:r>
             <w:r>
               <w:rPr>
@@ -2092,33 +1771,7 @@
                 <w:szCs w:val="18"/>
                 <w:lang w:eastAsia="en-GB"/>
               </w:rPr>
-              <w:t>Mysore </w:t>
-            </w:r>
-            <w:proofErr w:type="spellStart"/>
-            <w:r>
-              <w:rPr>
-                <w:rFonts w:eastAsia="Times New Roman" w:cs="Times New Roman"/>
-                <w:i/>
-                <w:iCs/>
-                <w:color w:val="555555"/>
-                <w:sz w:val="18"/>
-                <w:szCs w:val="18"/>
-                <w:lang w:eastAsia="en-GB"/>
-              </w:rPr>
-              <w:t>Bonda.webp</w:t>
-            </w:r>
-            <w:proofErr w:type="spellEnd"/>
-            <w:r>
-              <w:rPr>
-                <w:rFonts w:eastAsia="Times New Roman" w:cs="Times New Roman"/>
-                <w:i/>
-                <w:iCs/>
-                <w:color w:val="555555"/>
-                <w:sz w:val="18"/>
-                <w:szCs w:val="18"/>
-                <w:lang w:eastAsia="en-GB"/>
-              </w:rPr>
-              <w:t> — crisp shell, soft inside — the perfect breakfast bite.</w:t>
+              <w:t>Mysore Bonda.webp — crisp shell, soft inside — the perfect breakfast bite.</w:t>
             </w:r>
             <w:r>
               <w:rPr>
@@ -2162,27 +1815,7 @@
                 <w:szCs w:val="18"/>
                 <w:lang w:eastAsia="en-GB"/>
               </w:rPr>
-              <w:t>You liked this card last time. We chatted about Karnataka breakfasts beyond </w:t>
-            </w:r>
-            <w:proofErr w:type="spellStart"/>
-            <w:r>
-              <w:rPr>
-                <w:rFonts w:eastAsia="Times New Roman" w:cs="Times New Roman"/>
-                <w:sz w:val="18"/>
-                <w:szCs w:val="18"/>
-                <w:lang w:eastAsia="en-GB"/>
-              </w:rPr>
-              <w:t>idli</w:t>
-            </w:r>
-            <w:proofErr w:type="spellEnd"/>
-            <w:r>
-              <w:rPr>
-                <w:rFonts w:eastAsia="Times New Roman" w:cs="Times New Roman"/>
-                <w:sz w:val="18"/>
-                <w:szCs w:val="18"/>
-                <w:lang w:eastAsia="en-GB"/>
-              </w:rPr>
-              <w:t>/dosa last month.</w:t>
+              <w:t>You liked this card last time. We chatted about Karnataka breakfasts beyond idli/dosa last month.</w:t>
             </w:r>
             <w:r>
               <w:rPr>
@@ -2225,27 +1858,7 @@
                 <w:szCs w:val="20"/>
                 <w:lang w:eastAsia="en-GB"/>
               </w:rPr>
-              <w:t xml:space="preserve">Five ingredients, 25 minutes, plus a 90-minute curd-rest that's </w:t>
-            </w:r>
-            <w:proofErr w:type="gramStart"/>
-            <w:r>
-              <w:rPr>
-                <w:rFonts w:eastAsia="Times New Roman" w:cs="Times New Roman"/>
-                <w:sz w:val="20"/>
-                <w:szCs w:val="20"/>
-                <w:lang w:eastAsia="en-GB"/>
-              </w:rPr>
-              <w:t>actually doing</w:t>
-            </w:r>
-            <w:proofErr w:type="gramEnd"/>
-            <w:r>
-              <w:rPr>
-                <w:rFonts w:eastAsia="Times New Roman" w:cs="Times New Roman"/>
-                <w:sz w:val="20"/>
-                <w:szCs w:val="20"/>
-                <w:lang w:eastAsia="en-GB"/>
-              </w:rPr>
-              <w:t xml:space="preserve"> the </w:t>
+              <w:t xml:space="preserve">Five ingredients, 25 minutes, plus a 90-minute curd-rest that's actually doing the </w:t>
             </w:r>
             <w:r>
               <w:rPr>
@@ -2395,21 +2008,8 @@
                 <w:szCs w:val="20"/>
                 <w:lang w:eastAsia="en-GB"/>
               </w:rPr>
-              <w:t>The Roar of </w:t>
-            </w:r>
-            <w:proofErr w:type="spellStart"/>
-            <w:r>
-              <w:rPr>
-                <w:rFonts w:eastAsia="Times New Roman" w:cs="Times New Roman"/>
-                <w:b/>
-                <w:bCs/>
-                <w:sz w:val="20"/>
-                <w:szCs w:val="20"/>
-                <w:lang w:eastAsia="en-GB"/>
-              </w:rPr>
-              <w:t>Shivanasamudra</w:t>
-            </w:r>
-            <w:proofErr w:type="spellEnd"/>
+              <w:t>The Roar of Shivanasamudra</w:t>
+            </w:r>
             <w:r>
               <w:rPr>
                 <w:rFonts w:eastAsia="Times New Roman" w:cs="Times New Roman"/>
@@ -2487,33 +2087,7 @@
                 <w:szCs w:val="18"/>
                 <w:lang w:eastAsia="en-GB"/>
               </w:rPr>
-              <w:t>Roar of </w:t>
-            </w:r>
-            <w:proofErr w:type="spellStart"/>
-            <w:r>
-              <w:rPr>
-                <w:rFonts w:eastAsia="Times New Roman" w:cs="Times New Roman"/>
-                <w:i/>
-                <w:iCs/>
-                <w:color w:val="555555"/>
-                <w:sz w:val="18"/>
-                <w:szCs w:val="18"/>
-                <w:lang w:eastAsia="en-GB"/>
-              </w:rPr>
-              <w:t>Sivanasamudra.webp</w:t>
-            </w:r>
-            <w:proofErr w:type="spellEnd"/>
-            <w:r>
-              <w:rPr>
-                <w:rFonts w:eastAsia="Times New Roman" w:cs="Times New Roman"/>
-                <w:i/>
-                <w:iCs/>
-                <w:color w:val="555555"/>
-                <w:sz w:val="18"/>
-                <w:szCs w:val="18"/>
-                <w:lang w:eastAsia="en-GB"/>
-              </w:rPr>
-              <w:t> — the Cauvery doubles in volume — the waterfall is at its loudest right now.</w:t>
+              <w:t>Roar of Sivanasamudra.webp — the Cauvery doubles in volume — the waterfall is at its loudest right now.</w:t>
             </w:r>
             <w:r>
               <w:rPr>
@@ -2556,27 +2130,7 @@
                 <w:szCs w:val="18"/>
                 <w:lang w:eastAsia="en-GB"/>
               </w:rPr>
-              <w:t>In May, you asked me for monsoon drives within four hours. You bookmarked </w:t>
-            </w:r>
-            <w:proofErr w:type="spellStart"/>
-            <w:r>
-              <w:rPr>
-                <w:rFonts w:eastAsia="Times New Roman" w:cs="Times New Roman"/>
-                <w:sz w:val="18"/>
-                <w:szCs w:val="18"/>
-                <w:lang w:eastAsia="en-GB"/>
-              </w:rPr>
-              <w:t>Avathi</w:t>
-            </w:r>
-            <w:proofErr w:type="spellEnd"/>
-            <w:r>
-              <w:rPr>
-                <w:rFonts w:eastAsia="Times New Roman" w:cs="Times New Roman"/>
-                <w:sz w:val="18"/>
-                <w:szCs w:val="18"/>
-                <w:lang w:eastAsia="en-GB"/>
-              </w:rPr>
-              <w:t> and Muthyala Maduvu.</w:t>
+              <w:t>In May, you asked me for monsoon drives within four hours. You bookmarked Avathi and Muthyala Maduvu.</w:t>
             </w:r>
             <w:r>
               <w:rPr>
@@ -2618,67 +2172,7 @@
                 <w:szCs w:val="20"/>
                 <w:lang w:eastAsia="en-GB"/>
               </w:rPr>
-              <w:t>KRS released 14,200 cusecs into the Cauvery yesterday — </w:t>
-            </w:r>
-            <w:proofErr w:type="spellStart"/>
-            <w:r>
-              <w:rPr>
-                <w:rFonts w:eastAsia="Times New Roman" w:cs="Times New Roman"/>
-                <w:sz w:val="20"/>
-                <w:szCs w:val="20"/>
-                <w:lang w:eastAsia="en-GB"/>
-              </w:rPr>
-              <w:t>Shivanasamudra</w:t>
-            </w:r>
-            <w:proofErr w:type="spellEnd"/>
-            <w:r>
-              <w:rPr>
-                <w:rFonts w:eastAsia="Times New Roman" w:cs="Times New Roman"/>
-                <w:sz w:val="20"/>
-                <w:szCs w:val="20"/>
-                <w:lang w:eastAsia="en-GB"/>
-              </w:rPr>
-              <w:t> is louder than it's been in three monsoons. From Koramangala it's 3 hours via </w:t>
-            </w:r>
-            <w:proofErr w:type="spellStart"/>
-            <w:r>
-              <w:rPr>
-                <w:rFonts w:eastAsia="Times New Roman" w:cs="Times New Roman"/>
-                <w:sz w:val="20"/>
-                <w:szCs w:val="20"/>
-                <w:lang w:eastAsia="en-GB"/>
-              </w:rPr>
-              <w:t>Kanakapura</w:t>
-            </w:r>
-            <w:proofErr w:type="spellEnd"/>
-            <w:r>
-              <w:rPr>
-                <w:rFonts w:eastAsia="Times New Roman" w:cs="Times New Roman"/>
-                <w:sz w:val="20"/>
-                <w:szCs w:val="20"/>
-                <w:lang w:eastAsia="en-GB"/>
-              </w:rPr>
-              <w:t> Road. I'll plan it as a 6am-out, lunch-at-</w:t>
-            </w:r>
-            <w:proofErr w:type="spellStart"/>
-            <w:r>
-              <w:rPr>
-                <w:rFonts w:eastAsia="Times New Roman" w:cs="Times New Roman"/>
-                <w:sz w:val="20"/>
-                <w:szCs w:val="20"/>
-                <w:lang w:eastAsia="en-GB"/>
-              </w:rPr>
-              <w:t>Talakadu</w:t>
-            </w:r>
-            <w:proofErr w:type="spellEnd"/>
-            <w:r>
-              <w:rPr>
-                <w:rFonts w:eastAsia="Times New Roman" w:cs="Times New Roman"/>
-                <w:sz w:val="20"/>
-                <w:szCs w:val="20"/>
-                <w:lang w:eastAsia="en-GB"/>
-              </w:rPr>
-              <w:t>, back-by-4 day for you.</w:t>
+              <w:t>KRS released 14,200 cusecs into the Cauvery yesterday — Shivanasamudra is louder than it's been in three monsoons. From Koramangala it's 3 hours via Kanakapura Road. I'll plan it as a 6am-out, lunch-at-Talakadu, back-by-4 day for you.</w:t>
             </w:r>
             <w:r>
               <w:rPr>
@@ -2722,31 +2216,7 @@
                 <w:szCs w:val="20"/>
                 <w:lang w:eastAsia="en-GB"/>
               </w:rPr>
-              <w:t>Lock the </w:t>
-            </w:r>
-            <w:proofErr w:type="gramStart"/>
-            <w:r>
-              <w:rPr>
-                <w:rFonts w:eastAsia="Times New Roman" w:cs="Times New Roman"/>
-                <w:b/>
-                <w:bCs/>
-                <w:sz w:val="20"/>
-                <w:szCs w:val="20"/>
-                <w:lang w:eastAsia="en-GB"/>
-              </w:rPr>
-              <w:t>day-trip</w:t>
-            </w:r>
-            <w:proofErr w:type="gramEnd"/>
-            <w:r>
-              <w:rPr>
-                <w:rFonts w:eastAsia="Times New Roman" w:cs="Times New Roman"/>
-                <w:b/>
-                <w:bCs/>
-                <w:sz w:val="20"/>
-                <w:szCs w:val="20"/>
-                <w:lang w:eastAsia="en-GB"/>
-              </w:rPr>
-              <w:t>?</w:t>
+              <w:t>Lock the day-trip?</w:t>
             </w:r>
             <w:r>
               <w:rPr>
@@ -2922,33 +2392,7 @@
                 <w:szCs w:val="18"/>
                 <w:lang w:eastAsia="en-GB"/>
               </w:rPr>
-              <w:t>Silence of Vidhana </w:t>
-            </w:r>
-            <w:proofErr w:type="spellStart"/>
-            <w:r>
-              <w:rPr>
-                <w:rFonts w:eastAsia="Times New Roman" w:cs="Times New Roman"/>
-                <w:i/>
-                <w:iCs/>
-                <w:color w:val="555555"/>
-                <w:sz w:val="18"/>
-                <w:szCs w:val="18"/>
-                <w:lang w:eastAsia="en-GB"/>
-              </w:rPr>
-              <w:t>Soudha.webp</w:t>
-            </w:r>
-            <w:proofErr w:type="spellEnd"/>
-            <w:r>
-              <w:rPr>
-                <w:rFonts w:eastAsia="Times New Roman" w:cs="Times New Roman"/>
-                <w:i/>
-                <w:iCs/>
-                <w:color w:val="555555"/>
-                <w:sz w:val="18"/>
-                <w:szCs w:val="18"/>
-                <w:lang w:eastAsia="en-GB"/>
-              </w:rPr>
-              <w:t> — wet stone, mirrored reflections — the city's most photographed view at its calmest.</w:t>
+              <w:t>Silence of Vidhana Soudha.webp — wet stone, mirrored reflections — the city's most photographed view at its calmest.</w:t>
             </w:r>
             <w:r>
               <w:rPr>
@@ -2992,27 +2436,7 @@
                 <w:szCs w:val="18"/>
                 <w:lang w:eastAsia="en-GB"/>
               </w:rPr>
-              <w:t>The Fujifilm X100VI has been on your </w:t>
-            </w:r>
-            <w:proofErr w:type="spellStart"/>
-            <w:r>
-              <w:rPr>
-                <w:rFonts w:eastAsia="Times New Roman" w:cs="Times New Roman"/>
-                <w:sz w:val="18"/>
-                <w:szCs w:val="18"/>
-                <w:lang w:eastAsia="en-GB"/>
-              </w:rPr>
-              <w:t>wishlist</w:t>
-            </w:r>
-            <w:proofErr w:type="spellEnd"/>
-            <w:r>
-              <w:rPr>
-                <w:rFonts w:eastAsia="Times New Roman" w:cs="Times New Roman"/>
-                <w:sz w:val="18"/>
-                <w:szCs w:val="18"/>
-                <w:lang w:eastAsia="en-GB"/>
-              </w:rPr>
-              <w:t> six weeks. You asked me for sunrise spots beyond Nandi.</w:t>
+              <w:t>The Fujifilm X100VI has been on your wishlist six weeks. You asked me for sunrise spots beyond Nandi.</w:t>
             </w:r>
             <w:r>
               <w:rPr>
@@ -3055,27 +2479,7 @@
                 <w:szCs w:val="20"/>
                 <w:lang w:eastAsia="en-GB"/>
               </w:rPr>
-              <w:t>After last night's rain, Vidhana </w:t>
-            </w:r>
-            <w:proofErr w:type="spellStart"/>
-            <w:r>
-              <w:rPr>
-                <w:rFonts w:eastAsia="Times New Roman" w:cs="Times New Roman"/>
-                <w:sz w:val="20"/>
-                <w:szCs w:val="20"/>
-                <w:lang w:eastAsia="en-GB"/>
-              </w:rPr>
-              <w:t>Soudha's</w:t>
-            </w:r>
-            <w:proofErr w:type="spellEnd"/>
-            <w:r>
-              <w:rPr>
-                <w:rFonts w:eastAsia="Times New Roman" w:cs="Times New Roman"/>
-                <w:sz w:val="20"/>
-                <w:szCs w:val="20"/>
-                <w:lang w:eastAsia="en-GB"/>
-              </w:rPr>
-              <w:t> granite plinth is a black mirror. Sunrise tomorrow is 5:48 — your reflection shot lives in the 30 minutes before traffic kills it. I'll map you the route from Koramangala and wake you at 5:15.</w:t>
+              <w:t>After last night's rain, Vidhana Soudha's granite plinth is a black mirror. Sunrise tomorrow is 5:48 — your reflection shot lives in the 30 minutes before traffic kills it. I'll map you the route from Koramangala and wake you at 5:15.</w:t>
             </w:r>
             <w:r>
               <w:rPr>
@@ -3336,47 +2740,7 @@
                 <w:szCs w:val="18"/>
                 <w:lang w:eastAsia="en-GB"/>
               </w:rPr>
-              <w:t>Last month, you asked me where to take your parents — quiet, not loud. The restaurants you like — </w:t>
-            </w:r>
-            <w:proofErr w:type="spellStart"/>
-            <w:r>
-              <w:rPr>
-                <w:rFonts w:eastAsia="Times New Roman" w:cs="Times New Roman"/>
-                <w:sz w:val="18"/>
-                <w:szCs w:val="18"/>
-                <w:lang w:eastAsia="en-GB"/>
-              </w:rPr>
-              <w:t>Naru</w:t>
-            </w:r>
-            <w:proofErr w:type="spellEnd"/>
-            <w:r>
-              <w:rPr>
-                <w:rFonts w:eastAsia="Times New Roman" w:cs="Times New Roman"/>
-                <w:sz w:val="18"/>
-                <w:szCs w:val="18"/>
-                <w:lang w:eastAsia="en-GB"/>
-              </w:rPr>
-              <w:t>, Toast &amp; Tonic, </w:t>
-            </w:r>
-            <w:proofErr w:type="spellStart"/>
-            <w:r>
-              <w:rPr>
-                <w:rFonts w:eastAsia="Times New Roman" w:cs="Times New Roman"/>
-                <w:sz w:val="18"/>
-                <w:szCs w:val="18"/>
-                <w:lang w:eastAsia="en-GB"/>
-              </w:rPr>
-              <w:t>Farmlore</w:t>
-            </w:r>
-            <w:proofErr w:type="spellEnd"/>
-            <w:r>
-              <w:rPr>
-                <w:rFonts w:eastAsia="Times New Roman" w:cs="Times New Roman"/>
-                <w:sz w:val="18"/>
-                <w:szCs w:val="18"/>
-                <w:lang w:eastAsia="en-GB"/>
-              </w:rPr>
-              <w:t> — are too modern for the brief.</w:t>
+              <w:t>Last month, you asked me where to take your parents — quiet, not loud. The restaurants you like — Naru, Toast &amp; Tonic, Farmlore — are too modern for the brief.</w:t>
             </w:r>
             <w:r>
               <w:rPr>
@@ -3411,7 +2775,6 @@
                 <w:lang w:val="en-IN" w:eastAsia="en-GB"/>
               </w:rPr>
             </w:pPr>
-            <w:proofErr w:type="gramStart"/>
             <w:r>
               <w:rPr>
                 <w:rFonts w:eastAsia="Times New Roman" w:cs="Times New Roman"/>
@@ -3419,17 +2782,7 @@
                 <w:szCs w:val="20"/>
                 <w:lang w:eastAsia="en-GB"/>
               </w:rPr>
-              <w:t>Sunny's</w:t>
-            </w:r>
-            <w:proofErr w:type="gramEnd"/>
-            <w:r>
-              <w:rPr>
-                <w:rFonts w:eastAsia="Times New Roman" w:cs="Times New Roman"/>
-                <w:sz w:val="20"/>
-                <w:szCs w:val="20"/>
-                <w:lang w:eastAsia="en-GB"/>
-              </w:rPr>
-              <w:t> on Lavelle Road has run the same eggs benedict and slow coffee since 1990. Tuesday and Wednesday breakfasts are the calmest. Tell me the day they're in and I'll hold a 9am four-top for you.</w:t>
+              <w:t>Sunny's on Lavelle Road has run the same eggs benedict and slow coffee since 1990. Tuesday and Wednesday breakfasts are the calmest. Tell me the day they're in and I'll hold a 9am four-top for you.</w:t>
             </w:r>
             <w:r>
               <w:rPr>
@@ -3649,59 +3002,7 @@
                 <w:szCs w:val="18"/>
                 <w:lang w:eastAsia="en-GB"/>
               </w:rPr>
-              <w:t>Taste Bangalore's Pour </w:t>
-            </w:r>
-            <w:proofErr w:type="spellStart"/>
-            <w:r>
-              <w:rPr>
-                <w:rFonts w:eastAsia="Times New Roman" w:cs="Times New Roman"/>
-                <w:i/>
-                <w:iCs/>
-                <w:color w:val="555555"/>
-                <w:sz w:val="18"/>
-                <w:szCs w:val="18"/>
-                <w:lang w:eastAsia="en-GB"/>
-              </w:rPr>
-              <w:t>Over.webp</w:t>
-            </w:r>
-            <w:proofErr w:type="spellEnd"/>
-            <w:r>
-              <w:rPr>
-                <w:rFonts w:eastAsia="Times New Roman" w:cs="Times New Roman"/>
-                <w:i/>
-                <w:iCs/>
-                <w:color w:val="555555"/>
-                <w:sz w:val="18"/>
-                <w:szCs w:val="18"/>
-                <w:lang w:eastAsia="en-GB"/>
-              </w:rPr>
-              <w:t> — single-origin </w:t>
-            </w:r>
-            <w:proofErr w:type="spellStart"/>
-            <w:r>
-              <w:rPr>
-                <w:rFonts w:eastAsia="Times New Roman" w:cs="Times New Roman"/>
-                <w:i/>
-                <w:iCs/>
-                <w:color w:val="555555"/>
-                <w:sz w:val="18"/>
-                <w:szCs w:val="18"/>
-                <w:lang w:eastAsia="en-GB"/>
-              </w:rPr>
-              <w:t>Chikmagalur</w:t>
-            </w:r>
-            <w:proofErr w:type="spellEnd"/>
-            <w:r>
-              <w:rPr>
-                <w:rFonts w:eastAsia="Times New Roman" w:cs="Times New Roman"/>
-                <w:i/>
-                <w:iCs/>
-                <w:color w:val="555555"/>
-                <w:sz w:val="18"/>
-                <w:szCs w:val="18"/>
-                <w:lang w:eastAsia="en-GB"/>
-              </w:rPr>
-              <w:t>, slow drip, served by the cup.</w:t>
+              <w:t>Taste Bangalore's Pour Over.webp — single-origin Chikmagalur, slow drip, served by the cup.</w:t>
             </w:r>
             <w:r>
               <w:rPr>
@@ -3745,27 +3046,7 @@
                 <w:szCs w:val="18"/>
                 <w:lang w:eastAsia="en-GB"/>
               </w:rPr>
-              <w:t>In April, you asked me how to nail pour-over at home. The cast-iron kettle is on your </w:t>
-            </w:r>
-            <w:proofErr w:type="spellStart"/>
-            <w:r>
-              <w:rPr>
-                <w:rFonts w:eastAsia="Times New Roman" w:cs="Times New Roman"/>
-                <w:sz w:val="18"/>
-                <w:szCs w:val="18"/>
-                <w:lang w:eastAsia="en-GB"/>
-              </w:rPr>
-              <w:t>wishlist</w:t>
-            </w:r>
-            <w:proofErr w:type="spellEnd"/>
-            <w:r>
-              <w:rPr>
-                <w:rFonts w:eastAsia="Times New Roman" w:cs="Times New Roman"/>
-                <w:sz w:val="18"/>
-                <w:szCs w:val="18"/>
-                <w:lang w:eastAsia="en-GB"/>
-              </w:rPr>
-              <w:t>.</w:t>
+              <w:t>In April, you asked me how to nail pour-over at home. The cast-iron kettle is on your wishlist.</w:t>
             </w:r>
             <w:r>
               <w:rPr>
@@ -3808,27 +3089,7 @@
                 <w:szCs w:val="20"/>
                 <w:lang w:eastAsia="en-GB"/>
               </w:rPr>
-              <w:t>Three variables decide your cup — water at 92–94°C, medium-coarse grind, 2:1 bloom-pour. </w:t>
-            </w:r>
-            <w:proofErr w:type="spellStart"/>
-            <w:r>
-              <w:rPr>
-                <w:rFonts w:eastAsia="Times New Roman" w:cs="Times New Roman"/>
-                <w:sz w:val="20"/>
-                <w:szCs w:val="20"/>
-                <w:lang w:eastAsia="en-GB"/>
-              </w:rPr>
-              <w:t>Subko's</w:t>
-            </w:r>
-            <w:proofErr w:type="spellEnd"/>
-            <w:r>
-              <w:rPr>
-                <w:rFonts w:eastAsia="Times New Roman" w:cs="Times New Roman"/>
-                <w:sz w:val="20"/>
-                <w:szCs w:val="20"/>
-                <w:lang w:eastAsia="en-GB"/>
-              </w:rPr>
-              <w:t> Indiranagar runs a 45-minute walkthrough on Saturday mornings. I'll book you the 9am slot — that's the smallest group, and you can carry the technique straight back to your kitchen.</w:t>
+              <w:t>Three variables decide your cup — water at 92–94°C, medium-coarse grind, 2:1 bloom-pour. Subko's Indiranagar runs a 45-minute walkthrough on Saturday mornings. I'll book you the 9am slot — that's the smallest group, and you can carry the technique straight back to your kitchen.</w:t>
             </w:r>
             <w:r>
               <w:rPr>
@@ -3967,21 +3228,8 @@
                 <w:szCs w:val="20"/>
                 <w:lang w:eastAsia="en-GB"/>
               </w:rPr>
-              <w:t>A Morning at </w:t>
-            </w:r>
-            <w:proofErr w:type="spellStart"/>
-            <w:r>
-              <w:rPr>
-                <w:rFonts w:eastAsia="Times New Roman" w:cs="Times New Roman"/>
-                <w:b/>
-                <w:bCs/>
-                <w:sz w:val="20"/>
-                <w:szCs w:val="20"/>
-                <w:lang w:eastAsia="en-GB"/>
-              </w:rPr>
-              <w:t>TherPUP</w:t>
-            </w:r>
-            <w:proofErr w:type="spellEnd"/>
+              <w:t>A Morning at TherPUP</w:t>
+            </w:r>
             <w:r>
               <w:rPr>
                 <w:rFonts w:eastAsia="Times New Roman" w:cs="Times New Roman"/>
@@ -4049,7 +3297,6 @@
                 <w:lang w:val="en-IN" w:eastAsia="en-GB"/>
               </w:rPr>
             </w:pPr>
-            <w:proofErr w:type="spellStart"/>
             <w:r>
               <w:rPr>
                 <w:rFonts w:eastAsia="Times New Roman" w:cs="Times New Roman"/>
@@ -4060,46 +3307,7 @@
                 <w:szCs w:val="18"/>
                 <w:lang w:eastAsia="en-GB"/>
               </w:rPr>
-              <w:t>TherPUP</w:t>
-            </w:r>
-            <w:proofErr w:type="spellEnd"/>
-            <w:r>
-              <w:rPr>
-                <w:rFonts w:eastAsia="Times New Roman" w:cs="Times New Roman"/>
-                <w:i/>
-                <w:iCs/>
-                <w:color w:val="555555"/>
-                <w:sz w:val="18"/>
-                <w:szCs w:val="18"/>
-                <w:lang w:eastAsia="en-GB"/>
-              </w:rPr>
-              <w:t> </w:t>
-            </w:r>
-            <w:proofErr w:type="spellStart"/>
-            <w:r>
-              <w:rPr>
-                <w:rFonts w:eastAsia="Times New Roman" w:cs="Times New Roman"/>
-                <w:i/>
-                <w:iCs/>
-                <w:color w:val="555555"/>
-                <w:sz w:val="18"/>
-                <w:szCs w:val="18"/>
-                <w:lang w:eastAsia="en-GB"/>
-              </w:rPr>
-              <w:t>Cafe.webp</w:t>
-            </w:r>
-            <w:proofErr w:type="spellEnd"/>
-            <w:r>
-              <w:rPr>
-                <w:rFonts w:eastAsia="Times New Roman" w:cs="Times New Roman"/>
-                <w:i/>
-                <w:iCs/>
-                <w:color w:val="555555"/>
-                <w:sz w:val="18"/>
-                <w:szCs w:val="18"/>
-                <w:lang w:eastAsia="en-GB"/>
-              </w:rPr>
-              <w:t> — a pet cafe set up for visits — string lights overhead, garden seats, a resident golden.</w:t>
+              <w:t>TherPUP Cafe.webp — a pet cafe set up for visits — string lights overhead, garden seats, a resident golden.</w:t>
             </w:r>
             <w:r>
               <w:rPr>
@@ -4177,7 +3385,6 @@
                 <w:lang w:val="en-IN" w:eastAsia="en-GB"/>
               </w:rPr>
             </w:pPr>
-            <w:proofErr w:type="spellStart"/>
             <w:r>
               <w:rPr>
                 <w:rFonts w:eastAsia="Times New Roman" w:cs="Times New Roman"/>
@@ -4185,17 +3392,7 @@
                 <w:szCs w:val="20"/>
                 <w:lang w:eastAsia="en-GB"/>
               </w:rPr>
-              <w:t>TherPUP</w:t>
-            </w:r>
-            <w:proofErr w:type="spellEnd"/>
-            <w:r>
-              <w:rPr>
-                <w:rFonts w:eastAsia="Times New Roman" w:cs="Times New Roman"/>
-                <w:sz w:val="20"/>
-                <w:szCs w:val="20"/>
-                <w:lang w:eastAsia="en-GB"/>
-              </w:rPr>
-              <w:t> in Whitefield runs ₹500-an-hour visits with eight resident dogs. The 10–11am slot averages 4 guests against 16 in the afternoon — the dogs are loosest just after their morning walk. I'll hold a morning slot for you.</w:t>
+              <w:t>TherPUP in Whitefield runs ₹500-an-hour visits with eight resident dogs. The 10–11am slot averages 4 guests against 16 in the afternoon — the dogs are loosest just after their morning walk. I'll hold a morning slot for you.</w:t>
             </w:r>
             <w:r>
               <w:rPr>
@@ -4405,7 +3602,6 @@
                 <w:lang w:val="en-IN" w:eastAsia="en-GB"/>
               </w:rPr>
             </w:pPr>
-            <w:proofErr w:type="spellStart"/>
             <w:r>
               <w:rPr>
                 <w:rFonts w:eastAsia="Times New Roman" w:cs="Times New Roman"/>
@@ -4416,46 +3612,7 @@
                 <w:szCs w:val="18"/>
                 <w:lang w:eastAsia="en-GB"/>
               </w:rPr>
-              <w:t>Vinasa</w:t>
-            </w:r>
-            <w:proofErr w:type="spellEnd"/>
-            <w:r>
-              <w:rPr>
-                <w:rFonts w:eastAsia="Times New Roman" w:cs="Times New Roman"/>
-                <w:i/>
-                <w:iCs/>
-                <w:color w:val="555555"/>
-                <w:sz w:val="18"/>
-                <w:szCs w:val="18"/>
-                <w:lang w:eastAsia="en-GB"/>
-              </w:rPr>
-              <w:t> </w:t>
-            </w:r>
-            <w:proofErr w:type="spellStart"/>
-            <w:r>
-              <w:rPr>
-                <w:rFonts w:eastAsia="Times New Roman" w:cs="Times New Roman"/>
-                <w:i/>
-                <w:iCs/>
-                <w:color w:val="555555"/>
-                <w:sz w:val="18"/>
-                <w:szCs w:val="18"/>
-                <w:lang w:eastAsia="en-GB"/>
-              </w:rPr>
-              <w:t>Flow.webp</w:t>
-            </w:r>
-            <w:proofErr w:type="spellEnd"/>
-            <w:r>
-              <w:rPr>
-                <w:rFonts w:eastAsia="Times New Roman" w:cs="Times New Roman"/>
-                <w:i/>
-                <w:iCs/>
-                <w:color w:val="555555"/>
-                <w:sz w:val="18"/>
-                <w:szCs w:val="18"/>
-                <w:lang w:eastAsia="en-GB"/>
-              </w:rPr>
-              <w:t> — rain-washed paths and mist through the trees — an outdoor mat does the rest.</w:t>
+              <w:t>Vinasa Flow.webp — rain-washed paths and mist through the trees — an outdoor mat does the rest.</w:t>
             </w:r>
             <w:r>
               <w:rPr>

</xml_diff>